<commit_message>
Maj word : ajout d'un somaire, correction faute ortho, ajout de detail important ...
</commit_message>
<xml_diff>
--- a/Dossier final rendu sur Moodle/P26_Lundi14h_BOUAMAR_B_doc2.docx
+++ b/Dossier final rendu sur Moodle/P26_Lundi14h_BOUAMAR_B_doc2.docx
@@ -126,45 +126,1711 @@
           <w:szCs w:val="50"/>
         </w:rPr>
       </w:pPr>
-      <w:proofErr w:type="gramStart"/>
       <w:r>
         <w:rPr>
           <w:rFonts w:ascii="Arial" w:hAnsi="Arial" w:cs="Arial"/>
           <w:sz w:val="50"/>
           <w:szCs w:val="50"/>
         </w:rPr>
-        <w:t>du</w:t>
-      </w:r>
-      <w:proofErr w:type="gramEnd"/>
+        <w:t>du mini projet réalisé en C</w:t>
+      </w:r>
       <w:r>
         <w:rPr>
           <w:rFonts w:ascii="Arial" w:hAnsi="Arial" w:cs="Arial"/>
           <w:sz w:val="50"/>
           <w:szCs w:val="50"/>
         </w:rPr>
-        <w:t xml:space="preserve"> mini projet réalisé en C</w:t>
-      </w:r>
-      <w:r>
-        <w:rPr>
-          <w:rFonts w:ascii="Arial" w:hAnsi="Arial" w:cs="Arial"/>
+        <w:t xml:space="preserve"> et PYTHON</w:t>
+      </w:r>
+    </w:p>
+    <w:p>
+      <w:pPr>
+        <w:rPr>
           <w:sz w:val="50"/>
           <w:szCs w:val="50"/>
         </w:rPr>
-        <w:t xml:space="preserve"> et PYTHON</w:t>
-      </w:r>
-    </w:p>
-    <w:p>
-      <w:pPr>
+      </w:pPr>
+      <w:r>
         <w:rPr>
           <w:sz w:val="50"/>
           <w:szCs w:val="50"/>
         </w:rPr>
-      </w:pPr>
-      <w:r>
+        <w:br w:type="page"/>
+      </w:r>
+    </w:p>
+    <w:sdt>
+      <w:sdtPr>
+        <w:id w:val="2063289112"/>
+        <w:docPartObj>
+          <w:docPartGallery w:val="Table of Contents"/>
+          <w:docPartUnique/>
+        </w:docPartObj>
+      </w:sdtPr>
+      <w:sdtEndPr>
+        <w:rPr>
+          <w:rFonts w:ascii="Liberation Serif" w:eastAsia="NSimSun" w:hAnsi="Liberation Serif" w:cs="Lucida Sans"/>
+          <w:b/>
+          <w:bCs/>
+          <w:color w:val="auto"/>
+          <w:kern w:val="3"/>
+          <w:sz w:val="24"/>
+          <w:szCs w:val="24"/>
+          <w:lang w:eastAsia="zh-CN" w:bidi="hi-IN"/>
+        </w:rPr>
+      </w:sdtEndPr>
+      <w:sdtContent>
+        <w:p>
+          <w:pPr>
+            <w:pStyle w:val="En-ttedetabledesmatires"/>
+          </w:pPr>
+          <w:r>
+            <w:t>Table des matières</w:t>
+          </w:r>
+        </w:p>
+        <w:p>
+          <w:pPr>
+            <w:pStyle w:val="TM1"/>
+            <w:rPr>
+              <w:rFonts w:asciiTheme="minorHAnsi" w:eastAsiaTheme="minorEastAsia" w:hAnsiTheme="minorHAnsi" w:cstheme="minorBidi"/>
+              <w:noProof/>
+              <w:kern w:val="2"/>
+              <w:szCs w:val="24"/>
+              <w:lang w:eastAsia="fr-FR" w:bidi="ar-SA"/>
+              <w14:ligatures w14:val="standardContextual"/>
+            </w:rPr>
+          </w:pPr>
+          <w:r>
+            <w:fldChar w:fldCharType="begin"/>
+          </w:r>
+          <w:r>
+            <w:instrText xml:space="preserve"> TOC \o "1-3" \h \z \u </w:instrText>
+          </w:r>
+          <w:r>
+            <w:fldChar w:fldCharType="separate"/>
+          </w:r>
+          <w:hyperlink w:anchor="_Toc231331299" w:history="1">
+            <w:r>
+              <w:rPr>
+                <w:rStyle w:val="Lienhypertexte"/>
+                <w:noProof/>
+              </w:rPr>
+              <w:t>1.</w:t>
+            </w:r>
+            <w:r>
+              <w:rPr>
+                <w:rFonts w:asciiTheme="minorHAnsi" w:eastAsiaTheme="minorEastAsia" w:hAnsiTheme="minorHAnsi" w:cstheme="minorBidi"/>
+                <w:noProof/>
+                <w:kern w:val="2"/>
+                <w:szCs w:val="24"/>
+                <w:lang w:eastAsia="fr-FR" w:bidi="ar-SA"/>
+                <w14:ligatures w14:val="standardContextual"/>
+              </w:rPr>
+              <w:tab/>
+            </w:r>
+            <w:r>
+              <w:rPr>
+                <w:rStyle w:val="Lienhypertexte"/>
+                <w:noProof/>
+              </w:rPr>
+              <w:t>Présentation</w:t>
+            </w:r>
+            <w:r>
+              <w:rPr>
+                <w:noProof/>
+                <w:webHidden/>
+              </w:rPr>
+              <w:tab/>
+            </w:r>
+            <w:r>
+              <w:rPr>
+                <w:noProof/>
+                <w:webHidden/>
+              </w:rPr>
+              <w:fldChar w:fldCharType="begin"/>
+            </w:r>
+            <w:r>
+              <w:rPr>
+                <w:noProof/>
+                <w:webHidden/>
+              </w:rPr>
+              <w:instrText xml:space="preserve"> PAGEREF _Toc231331299 \h </w:instrText>
+            </w:r>
+            <w:r>
+              <w:rPr>
+                <w:noProof/>
+                <w:webHidden/>
+              </w:rPr>
+            </w:r>
+            <w:r>
+              <w:rPr>
+                <w:noProof/>
+                <w:webHidden/>
+              </w:rPr>
+              <w:fldChar w:fldCharType="separate"/>
+            </w:r>
+            <w:r>
+              <w:rPr>
+                <w:noProof/>
+                <w:webHidden/>
+              </w:rPr>
+              <w:t>3</w:t>
+            </w:r>
+            <w:r>
+              <w:rPr>
+                <w:noProof/>
+                <w:webHidden/>
+              </w:rPr>
+              <w:fldChar w:fldCharType="end"/>
+            </w:r>
+          </w:hyperlink>
+        </w:p>
+        <w:p>
+          <w:pPr>
+            <w:pStyle w:val="TM1"/>
+            <w:rPr>
+              <w:rFonts w:asciiTheme="minorHAnsi" w:eastAsiaTheme="minorEastAsia" w:hAnsiTheme="minorHAnsi" w:cstheme="minorBidi"/>
+              <w:noProof/>
+              <w:kern w:val="2"/>
+              <w:szCs w:val="24"/>
+              <w:lang w:eastAsia="fr-FR" w:bidi="ar-SA"/>
+              <w14:ligatures w14:val="standardContextual"/>
+            </w:rPr>
+          </w:pPr>
+          <w:hyperlink w:anchor="_Toc231331300" w:history="1">
+            <w:r>
+              <w:rPr>
+                <w:rStyle w:val="Lienhypertexte"/>
+                <w:noProof/>
+              </w:rPr>
+              <w:t>2.</w:t>
+            </w:r>
+            <w:r>
+              <w:rPr>
+                <w:rFonts w:asciiTheme="minorHAnsi" w:eastAsiaTheme="minorEastAsia" w:hAnsiTheme="minorHAnsi" w:cstheme="minorBidi"/>
+                <w:noProof/>
+                <w:kern w:val="2"/>
+                <w:szCs w:val="24"/>
+                <w:lang w:eastAsia="fr-FR" w:bidi="ar-SA"/>
+                <w14:ligatures w14:val="standardContextual"/>
+              </w:rPr>
+              <w:tab/>
+            </w:r>
+            <w:r>
+              <w:rPr>
+                <w:rStyle w:val="Lienhypertexte"/>
+                <w:noProof/>
+              </w:rPr>
+              <w:t>Exécution du programme écrit en C</w:t>
+            </w:r>
+            <w:r>
+              <w:rPr>
+                <w:noProof/>
+                <w:webHidden/>
+              </w:rPr>
+              <w:tab/>
+            </w:r>
+            <w:r>
+              <w:rPr>
+                <w:noProof/>
+                <w:webHidden/>
+              </w:rPr>
+              <w:fldChar w:fldCharType="begin"/>
+            </w:r>
+            <w:r>
+              <w:rPr>
+                <w:noProof/>
+                <w:webHidden/>
+              </w:rPr>
+              <w:instrText xml:space="preserve"> PAGEREF _Toc231331300 \h </w:instrText>
+            </w:r>
+            <w:r>
+              <w:rPr>
+                <w:noProof/>
+                <w:webHidden/>
+              </w:rPr>
+            </w:r>
+            <w:r>
+              <w:rPr>
+                <w:noProof/>
+                <w:webHidden/>
+              </w:rPr>
+              <w:fldChar w:fldCharType="separate"/>
+            </w:r>
+            <w:r>
+              <w:rPr>
+                <w:noProof/>
+                <w:webHidden/>
+              </w:rPr>
+              <w:t>4</w:t>
+            </w:r>
+            <w:r>
+              <w:rPr>
+                <w:noProof/>
+                <w:webHidden/>
+              </w:rPr>
+              <w:fldChar w:fldCharType="end"/>
+            </w:r>
+          </w:hyperlink>
+        </w:p>
+        <w:p>
+          <w:pPr>
+            <w:pStyle w:val="TM2"/>
+            <w:tabs>
+              <w:tab w:val="left" w:pos="960"/>
+              <w:tab w:val="right" w:leader="dot" w:pos="10055"/>
+            </w:tabs>
+            <w:rPr>
+              <w:rFonts w:asciiTheme="minorHAnsi" w:eastAsiaTheme="minorEastAsia" w:hAnsiTheme="minorHAnsi" w:cstheme="minorBidi"/>
+              <w:noProof/>
+              <w:kern w:val="2"/>
+              <w:szCs w:val="24"/>
+              <w:lang w:eastAsia="fr-FR" w:bidi="ar-SA"/>
+              <w14:ligatures w14:val="standardContextual"/>
+            </w:rPr>
+          </w:pPr>
+          <w:hyperlink w:anchor="_Toc231331301" w:history="1">
+            <w:r>
+              <w:rPr>
+                <w:rStyle w:val="Lienhypertexte"/>
+                <w:noProof/>
+              </w:rPr>
+              <w:t>2.1.</w:t>
+            </w:r>
+            <w:r>
+              <w:rPr>
+                <w:rFonts w:asciiTheme="minorHAnsi" w:eastAsiaTheme="minorEastAsia" w:hAnsiTheme="minorHAnsi" w:cstheme="minorBidi"/>
+                <w:noProof/>
+                <w:kern w:val="2"/>
+                <w:szCs w:val="24"/>
+                <w:lang w:eastAsia="fr-FR" w:bidi="ar-SA"/>
+                <w14:ligatures w14:val="standardContextual"/>
+              </w:rPr>
+              <w:tab/>
+            </w:r>
+            <w:r>
+              <w:rPr>
+                <w:rStyle w:val="Lienhypertexte"/>
+                <w:noProof/>
+              </w:rPr>
+              <w:t>Test #1 – Cas nominal</w:t>
+            </w:r>
+            <w:r>
+              <w:rPr>
+                <w:noProof/>
+                <w:webHidden/>
+              </w:rPr>
+              <w:tab/>
+            </w:r>
+            <w:r>
+              <w:rPr>
+                <w:noProof/>
+                <w:webHidden/>
+              </w:rPr>
+              <w:fldChar w:fldCharType="begin"/>
+            </w:r>
+            <w:r>
+              <w:rPr>
+                <w:noProof/>
+                <w:webHidden/>
+              </w:rPr>
+              <w:instrText xml:space="preserve"> PAGEREF _Toc231331301 \h </w:instrText>
+            </w:r>
+            <w:r>
+              <w:rPr>
+                <w:noProof/>
+                <w:webHidden/>
+              </w:rPr>
+            </w:r>
+            <w:r>
+              <w:rPr>
+                <w:noProof/>
+                <w:webHidden/>
+              </w:rPr>
+              <w:fldChar w:fldCharType="separate"/>
+            </w:r>
+            <w:r>
+              <w:rPr>
+                <w:noProof/>
+                <w:webHidden/>
+              </w:rPr>
+              <w:t>4</w:t>
+            </w:r>
+            <w:r>
+              <w:rPr>
+                <w:noProof/>
+                <w:webHidden/>
+              </w:rPr>
+              <w:fldChar w:fldCharType="end"/>
+            </w:r>
+          </w:hyperlink>
+        </w:p>
+        <w:p>
+          <w:pPr>
+            <w:pStyle w:val="TM3"/>
+            <w:tabs>
+              <w:tab w:val="left" w:pos="960"/>
+              <w:tab w:val="right" w:leader="dot" w:pos="10055"/>
+            </w:tabs>
+            <w:rPr>
+              <w:rFonts w:asciiTheme="minorHAnsi" w:eastAsiaTheme="minorEastAsia" w:hAnsiTheme="minorHAnsi" w:cstheme="minorBidi"/>
+              <w:noProof/>
+              <w:kern w:val="2"/>
+              <w:szCs w:val="24"/>
+              <w:lang w:eastAsia="fr-FR" w:bidi="ar-SA"/>
+              <w14:ligatures w14:val="standardContextual"/>
+            </w:rPr>
+          </w:pPr>
+          <w:hyperlink w:anchor="_Toc231331302" w:history="1">
+            <w:r>
+              <w:rPr>
+                <w:rStyle w:val="Lienhypertexte"/>
+                <w:noProof/>
+              </w:rPr>
+              <w:t>a)</w:t>
+            </w:r>
+            <w:r>
+              <w:rPr>
+                <w:rFonts w:asciiTheme="minorHAnsi" w:eastAsiaTheme="minorEastAsia" w:hAnsiTheme="minorHAnsi" w:cstheme="minorBidi"/>
+                <w:noProof/>
+                <w:kern w:val="2"/>
+                <w:szCs w:val="24"/>
+                <w:lang w:eastAsia="fr-FR" w:bidi="ar-SA"/>
+                <w14:ligatures w14:val="standardContextual"/>
+              </w:rPr>
+              <w:tab/>
+            </w:r>
+            <w:r>
+              <w:rPr>
+                <w:rStyle w:val="Lienhypertexte"/>
+                <w:noProof/>
+              </w:rPr>
+              <w:t>Explication sur l’exécution</w:t>
+            </w:r>
+            <w:r>
+              <w:rPr>
+                <w:noProof/>
+                <w:webHidden/>
+              </w:rPr>
+              <w:tab/>
+            </w:r>
+            <w:r>
+              <w:rPr>
+                <w:noProof/>
+                <w:webHidden/>
+              </w:rPr>
+              <w:fldChar w:fldCharType="begin"/>
+            </w:r>
+            <w:r>
+              <w:rPr>
+                <w:noProof/>
+                <w:webHidden/>
+              </w:rPr>
+              <w:instrText xml:space="preserve"> PAGEREF _Toc231331302 \h </w:instrText>
+            </w:r>
+            <w:r>
+              <w:rPr>
+                <w:noProof/>
+                <w:webHidden/>
+              </w:rPr>
+            </w:r>
+            <w:r>
+              <w:rPr>
+                <w:noProof/>
+                <w:webHidden/>
+              </w:rPr>
+              <w:fldChar w:fldCharType="separate"/>
+            </w:r>
+            <w:r>
+              <w:rPr>
+                <w:noProof/>
+                <w:webHidden/>
+              </w:rPr>
+              <w:t>5</w:t>
+            </w:r>
+            <w:r>
+              <w:rPr>
+                <w:noProof/>
+                <w:webHidden/>
+              </w:rPr>
+              <w:fldChar w:fldCharType="end"/>
+            </w:r>
+          </w:hyperlink>
+        </w:p>
+        <w:p>
+          <w:pPr>
+            <w:pStyle w:val="TM2"/>
+            <w:tabs>
+              <w:tab w:val="left" w:pos="960"/>
+              <w:tab w:val="right" w:leader="dot" w:pos="10055"/>
+            </w:tabs>
+            <w:rPr>
+              <w:rFonts w:asciiTheme="minorHAnsi" w:eastAsiaTheme="minorEastAsia" w:hAnsiTheme="minorHAnsi" w:cstheme="minorBidi"/>
+              <w:noProof/>
+              <w:kern w:val="2"/>
+              <w:szCs w:val="24"/>
+              <w:lang w:eastAsia="fr-FR" w:bidi="ar-SA"/>
+              <w14:ligatures w14:val="standardContextual"/>
+            </w:rPr>
+          </w:pPr>
+          <w:hyperlink w:anchor="_Toc231331303" w:history="1">
+            <w:r>
+              <w:rPr>
+                <w:rStyle w:val="Lienhypertexte"/>
+                <w:noProof/>
+              </w:rPr>
+              <w:t>2.2.</w:t>
+            </w:r>
+            <w:r>
+              <w:rPr>
+                <w:rFonts w:asciiTheme="minorHAnsi" w:eastAsiaTheme="minorEastAsia" w:hAnsiTheme="minorHAnsi" w:cstheme="minorBidi"/>
+                <w:noProof/>
+                <w:kern w:val="2"/>
+                <w:szCs w:val="24"/>
+                <w:lang w:eastAsia="fr-FR" w:bidi="ar-SA"/>
+                <w14:ligatures w14:val="standardContextual"/>
+              </w:rPr>
+              <w:tab/>
+            </w:r>
+            <w:r>
+              <w:rPr>
+                <w:rStyle w:val="Lienhypertexte"/>
+                <w:noProof/>
+              </w:rPr>
+              <w:t>Test #2 – Cas simple</w:t>
+            </w:r>
+            <w:r>
+              <w:rPr>
+                <w:noProof/>
+                <w:webHidden/>
+              </w:rPr>
+              <w:tab/>
+            </w:r>
+            <w:r>
+              <w:rPr>
+                <w:noProof/>
+                <w:webHidden/>
+              </w:rPr>
+              <w:fldChar w:fldCharType="begin"/>
+            </w:r>
+            <w:r>
+              <w:rPr>
+                <w:noProof/>
+                <w:webHidden/>
+              </w:rPr>
+              <w:instrText xml:space="preserve"> PAGEREF _Toc231331303 \h </w:instrText>
+            </w:r>
+            <w:r>
+              <w:rPr>
+                <w:noProof/>
+                <w:webHidden/>
+              </w:rPr>
+            </w:r>
+            <w:r>
+              <w:rPr>
+                <w:noProof/>
+                <w:webHidden/>
+              </w:rPr>
+              <w:fldChar w:fldCharType="separate"/>
+            </w:r>
+            <w:r>
+              <w:rPr>
+                <w:noProof/>
+                <w:webHidden/>
+              </w:rPr>
+              <w:t>7</w:t>
+            </w:r>
+            <w:r>
+              <w:rPr>
+                <w:noProof/>
+                <w:webHidden/>
+              </w:rPr>
+              <w:fldChar w:fldCharType="end"/>
+            </w:r>
+          </w:hyperlink>
+        </w:p>
+        <w:p>
+          <w:pPr>
+            <w:pStyle w:val="TM2"/>
+            <w:tabs>
+              <w:tab w:val="left" w:pos="960"/>
+              <w:tab w:val="right" w:leader="dot" w:pos="10055"/>
+            </w:tabs>
+            <w:rPr>
+              <w:rFonts w:asciiTheme="minorHAnsi" w:eastAsiaTheme="minorEastAsia" w:hAnsiTheme="minorHAnsi" w:cstheme="minorBidi"/>
+              <w:noProof/>
+              <w:kern w:val="2"/>
+              <w:szCs w:val="24"/>
+              <w:lang w:eastAsia="fr-FR" w:bidi="ar-SA"/>
+              <w14:ligatures w14:val="standardContextual"/>
+            </w:rPr>
+          </w:pPr>
+          <w:hyperlink w:anchor="_Toc231331304" w:history="1">
+            <w:r>
+              <w:rPr>
+                <w:rStyle w:val="Lienhypertexte"/>
+                <w:noProof/>
+              </w:rPr>
+              <w:t>2.3.</w:t>
+            </w:r>
+            <w:r>
+              <w:rPr>
+                <w:rFonts w:asciiTheme="minorHAnsi" w:eastAsiaTheme="minorEastAsia" w:hAnsiTheme="minorHAnsi" w:cstheme="minorBidi"/>
+                <w:noProof/>
+                <w:kern w:val="2"/>
+                <w:szCs w:val="24"/>
+                <w:lang w:eastAsia="fr-FR" w:bidi="ar-SA"/>
+                <w14:ligatures w14:val="standardContextual"/>
+              </w:rPr>
+              <w:tab/>
+            </w:r>
+            <w:r>
+              <w:rPr>
+                <w:rStyle w:val="Lienhypertexte"/>
+                <w:noProof/>
+              </w:rPr>
+              <w:t>Test#2 – 1</w:t>
+            </w:r>
+            <w:r>
+              <w:rPr>
+                <w:rStyle w:val="Lienhypertexte"/>
+                <w:noProof/>
+                <w:vertAlign w:val="superscript"/>
+              </w:rPr>
+              <w:t>er</w:t>
+            </w:r>
+            <w:r>
+              <w:rPr>
+                <w:rStyle w:val="Lienhypertexte"/>
+                <w:noProof/>
+              </w:rPr>
+              <w:t xml:space="preserve"> pivot à 0</w:t>
+            </w:r>
+            <w:r>
+              <w:rPr>
+                <w:noProof/>
+                <w:webHidden/>
+              </w:rPr>
+              <w:tab/>
+            </w:r>
+            <w:r>
+              <w:rPr>
+                <w:noProof/>
+                <w:webHidden/>
+              </w:rPr>
+              <w:fldChar w:fldCharType="begin"/>
+            </w:r>
+            <w:r>
+              <w:rPr>
+                <w:noProof/>
+                <w:webHidden/>
+              </w:rPr>
+              <w:instrText xml:space="preserve"> PAGEREF _Toc231331304 \h </w:instrText>
+            </w:r>
+            <w:r>
+              <w:rPr>
+                <w:noProof/>
+                <w:webHidden/>
+              </w:rPr>
+            </w:r>
+            <w:r>
+              <w:rPr>
+                <w:noProof/>
+                <w:webHidden/>
+              </w:rPr>
+              <w:fldChar w:fldCharType="separate"/>
+            </w:r>
+            <w:r>
+              <w:rPr>
+                <w:noProof/>
+                <w:webHidden/>
+              </w:rPr>
+              <w:t>8</w:t>
+            </w:r>
+            <w:r>
+              <w:rPr>
+                <w:noProof/>
+                <w:webHidden/>
+              </w:rPr>
+              <w:fldChar w:fldCharType="end"/>
+            </w:r>
+          </w:hyperlink>
+        </w:p>
+        <w:p>
+          <w:pPr>
+            <w:pStyle w:val="TM2"/>
+            <w:tabs>
+              <w:tab w:val="left" w:pos="960"/>
+              <w:tab w:val="right" w:leader="dot" w:pos="10055"/>
+            </w:tabs>
+            <w:rPr>
+              <w:rFonts w:asciiTheme="minorHAnsi" w:eastAsiaTheme="minorEastAsia" w:hAnsiTheme="minorHAnsi" w:cstheme="minorBidi"/>
+              <w:noProof/>
+              <w:kern w:val="2"/>
+              <w:szCs w:val="24"/>
+              <w:lang w:eastAsia="fr-FR" w:bidi="ar-SA"/>
+              <w14:ligatures w14:val="standardContextual"/>
+            </w:rPr>
+          </w:pPr>
+          <w:hyperlink w:anchor="_Toc231331305" w:history="1">
+            <w:r>
+              <w:rPr>
+                <w:rStyle w:val="Lienhypertexte"/>
+                <w:noProof/>
+              </w:rPr>
+              <w:t>2.4.</w:t>
+            </w:r>
+            <w:r>
+              <w:rPr>
+                <w:rFonts w:asciiTheme="minorHAnsi" w:eastAsiaTheme="minorEastAsia" w:hAnsiTheme="minorHAnsi" w:cstheme="minorBidi"/>
+                <w:noProof/>
+                <w:kern w:val="2"/>
+                <w:szCs w:val="24"/>
+                <w:lang w:eastAsia="fr-FR" w:bidi="ar-SA"/>
+                <w14:ligatures w14:val="standardContextual"/>
+              </w:rPr>
+              <w:tab/>
+            </w:r>
+            <w:r>
+              <w:rPr>
+                <w:rStyle w:val="Lienhypertexte"/>
+                <w:noProof/>
+              </w:rPr>
+              <w:t>Test#3 – Le 2</w:t>
+            </w:r>
+            <w:r>
+              <w:rPr>
+                <w:rStyle w:val="Lienhypertexte"/>
+                <w:noProof/>
+                <w:vertAlign w:val="superscript"/>
+              </w:rPr>
+              <w:t>nd</w:t>
+            </w:r>
+            <w:r>
+              <w:rPr>
+                <w:rStyle w:val="Lienhypertexte"/>
+                <w:noProof/>
+              </w:rPr>
+              <w:t xml:space="preserve"> pivot à 0 après élimination</w:t>
+            </w:r>
+            <w:r>
+              <w:rPr>
+                <w:noProof/>
+                <w:webHidden/>
+              </w:rPr>
+              <w:tab/>
+            </w:r>
+            <w:r>
+              <w:rPr>
+                <w:noProof/>
+                <w:webHidden/>
+              </w:rPr>
+              <w:fldChar w:fldCharType="begin"/>
+            </w:r>
+            <w:r>
+              <w:rPr>
+                <w:noProof/>
+                <w:webHidden/>
+              </w:rPr>
+              <w:instrText xml:space="preserve"> PAGEREF _Toc231331305 \h </w:instrText>
+            </w:r>
+            <w:r>
+              <w:rPr>
+                <w:noProof/>
+                <w:webHidden/>
+              </w:rPr>
+            </w:r>
+            <w:r>
+              <w:rPr>
+                <w:noProof/>
+                <w:webHidden/>
+              </w:rPr>
+              <w:fldChar w:fldCharType="separate"/>
+            </w:r>
+            <w:r>
+              <w:rPr>
+                <w:noProof/>
+                <w:webHidden/>
+              </w:rPr>
+              <w:t>9</w:t>
+            </w:r>
+            <w:r>
+              <w:rPr>
+                <w:noProof/>
+                <w:webHidden/>
+              </w:rPr>
+              <w:fldChar w:fldCharType="end"/>
+            </w:r>
+          </w:hyperlink>
+        </w:p>
+        <w:p>
+          <w:pPr>
+            <w:pStyle w:val="TM2"/>
+            <w:tabs>
+              <w:tab w:val="left" w:pos="960"/>
+              <w:tab w:val="right" w:leader="dot" w:pos="10055"/>
+            </w:tabs>
+            <w:rPr>
+              <w:rFonts w:asciiTheme="minorHAnsi" w:eastAsiaTheme="minorEastAsia" w:hAnsiTheme="minorHAnsi" w:cstheme="minorBidi"/>
+              <w:noProof/>
+              <w:kern w:val="2"/>
+              <w:szCs w:val="24"/>
+              <w:lang w:eastAsia="fr-FR" w:bidi="ar-SA"/>
+              <w14:ligatures w14:val="standardContextual"/>
+            </w:rPr>
+          </w:pPr>
+          <w:hyperlink w:anchor="_Toc231331306" w:history="1">
+            <w:r>
+              <w:rPr>
+                <w:rStyle w:val="Lienhypertexte"/>
+                <w:noProof/>
+              </w:rPr>
+              <w:t>2.5.</w:t>
+            </w:r>
+            <w:r>
+              <w:rPr>
+                <w:rFonts w:asciiTheme="minorHAnsi" w:eastAsiaTheme="minorEastAsia" w:hAnsiTheme="minorHAnsi" w:cstheme="minorBidi"/>
+                <w:noProof/>
+                <w:kern w:val="2"/>
+                <w:szCs w:val="24"/>
+                <w:lang w:eastAsia="fr-FR" w:bidi="ar-SA"/>
+                <w14:ligatures w14:val="standardContextual"/>
+              </w:rPr>
+              <w:tab/>
+            </w:r>
+            <w:r>
+              <w:rPr>
+                <w:rStyle w:val="Lienhypertexte"/>
+                <w:noProof/>
+              </w:rPr>
+              <w:t>Test #4 – Le dernier pivot à 0</w:t>
+            </w:r>
+            <w:r>
+              <w:rPr>
+                <w:noProof/>
+                <w:webHidden/>
+              </w:rPr>
+              <w:tab/>
+            </w:r>
+            <w:r>
+              <w:rPr>
+                <w:noProof/>
+                <w:webHidden/>
+              </w:rPr>
+              <w:fldChar w:fldCharType="begin"/>
+            </w:r>
+            <w:r>
+              <w:rPr>
+                <w:noProof/>
+                <w:webHidden/>
+              </w:rPr>
+              <w:instrText xml:space="preserve"> PAGEREF _Toc231331306 \h </w:instrText>
+            </w:r>
+            <w:r>
+              <w:rPr>
+                <w:noProof/>
+                <w:webHidden/>
+              </w:rPr>
+            </w:r>
+            <w:r>
+              <w:rPr>
+                <w:noProof/>
+                <w:webHidden/>
+              </w:rPr>
+              <w:fldChar w:fldCharType="separate"/>
+            </w:r>
+            <w:r>
+              <w:rPr>
+                <w:noProof/>
+                <w:webHidden/>
+              </w:rPr>
+              <w:t>10</w:t>
+            </w:r>
+            <w:r>
+              <w:rPr>
+                <w:noProof/>
+                <w:webHidden/>
+              </w:rPr>
+              <w:fldChar w:fldCharType="end"/>
+            </w:r>
+          </w:hyperlink>
+        </w:p>
+        <w:p>
+          <w:pPr>
+            <w:pStyle w:val="TM1"/>
+            <w:rPr>
+              <w:rFonts w:asciiTheme="minorHAnsi" w:eastAsiaTheme="minorEastAsia" w:hAnsiTheme="minorHAnsi" w:cstheme="minorBidi"/>
+              <w:noProof/>
+              <w:kern w:val="2"/>
+              <w:szCs w:val="24"/>
+              <w:lang w:eastAsia="fr-FR" w:bidi="ar-SA"/>
+              <w14:ligatures w14:val="standardContextual"/>
+            </w:rPr>
+          </w:pPr>
+          <w:hyperlink w:anchor="_Toc231331307" w:history="1">
+            <w:r>
+              <w:rPr>
+                <w:rStyle w:val="Lienhypertexte"/>
+                <w:noProof/>
+              </w:rPr>
+              <w:t>3.</w:t>
+            </w:r>
+            <w:r>
+              <w:rPr>
+                <w:rFonts w:asciiTheme="minorHAnsi" w:eastAsiaTheme="minorEastAsia" w:hAnsiTheme="minorHAnsi" w:cstheme="minorBidi"/>
+                <w:noProof/>
+                <w:kern w:val="2"/>
+                <w:szCs w:val="24"/>
+                <w:lang w:eastAsia="fr-FR" w:bidi="ar-SA"/>
+                <w14:ligatures w14:val="standardContextual"/>
+              </w:rPr>
+              <w:tab/>
+            </w:r>
+            <w:r>
+              <w:rPr>
+                <w:rStyle w:val="Lienhypertexte"/>
+                <w:noProof/>
+              </w:rPr>
+              <w:t>Exécution du programme écrit en PYTHON</w:t>
+            </w:r>
+            <w:r>
+              <w:rPr>
+                <w:noProof/>
+                <w:webHidden/>
+              </w:rPr>
+              <w:tab/>
+            </w:r>
+            <w:r>
+              <w:rPr>
+                <w:noProof/>
+                <w:webHidden/>
+              </w:rPr>
+              <w:fldChar w:fldCharType="begin"/>
+            </w:r>
+            <w:r>
+              <w:rPr>
+                <w:noProof/>
+                <w:webHidden/>
+              </w:rPr>
+              <w:instrText xml:space="preserve"> PAGEREF _Toc231331307 \h </w:instrText>
+            </w:r>
+            <w:r>
+              <w:rPr>
+                <w:noProof/>
+                <w:webHidden/>
+              </w:rPr>
+            </w:r>
+            <w:r>
+              <w:rPr>
+                <w:noProof/>
+                <w:webHidden/>
+              </w:rPr>
+              <w:fldChar w:fldCharType="separate"/>
+            </w:r>
+            <w:r>
+              <w:rPr>
+                <w:noProof/>
+                <w:webHidden/>
+              </w:rPr>
+              <w:t>11</w:t>
+            </w:r>
+            <w:r>
+              <w:rPr>
+                <w:noProof/>
+                <w:webHidden/>
+              </w:rPr>
+              <w:fldChar w:fldCharType="end"/>
+            </w:r>
+          </w:hyperlink>
+        </w:p>
+        <w:p>
+          <w:pPr>
+            <w:pStyle w:val="TM2"/>
+            <w:tabs>
+              <w:tab w:val="left" w:pos="960"/>
+              <w:tab w:val="right" w:leader="dot" w:pos="10055"/>
+            </w:tabs>
+            <w:rPr>
+              <w:rFonts w:asciiTheme="minorHAnsi" w:eastAsiaTheme="minorEastAsia" w:hAnsiTheme="minorHAnsi" w:cstheme="minorBidi"/>
+              <w:noProof/>
+              <w:kern w:val="2"/>
+              <w:szCs w:val="24"/>
+              <w:lang w:eastAsia="fr-FR" w:bidi="ar-SA"/>
+              <w14:ligatures w14:val="standardContextual"/>
+            </w:rPr>
+          </w:pPr>
+          <w:hyperlink w:anchor="_Toc231331308" w:history="1">
+            <w:r>
+              <w:rPr>
+                <w:rStyle w:val="Lienhypertexte"/>
+                <w:noProof/>
+              </w:rPr>
+              <w:t>3.1.</w:t>
+            </w:r>
+            <w:r>
+              <w:rPr>
+                <w:rFonts w:asciiTheme="minorHAnsi" w:eastAsiaTheme="minorEastAsia" w:hAnsiTheme="minorHAnsi" w:cstheme="minorBidi"/>
+                <w:noProof/>
+                <w:kern w:val="2"/>
+                <w:szCs w:val="24"/>
+                <w:lang w:eastAsia="fr-FR" w:bidi="ar-SA"/>
+                <w14:ligatures w14:val="standardContextual"/>
+              </w:rPr>
+              <w:tab/>
+            </w:r>
+            <w:r>
+              <w:rPr>
+                <w:rStyle w:val="Lienhypertexte"/>
+                <w:noProof/>
+              </w:rPr>
+              <w:t>Test #1 – Cas nominal</w:t>
+            </w:r>
+            <w:r>
+              <w:rPr>
+                <w:noProof/>
+                <w:webHidden/>
+              </w:rPr>
+              <w:tab/>
+            </w:r>
+            <w:r>
+              <w:rPr>
+                <w:noProof/>
+                <w:webHidden/>
+              </w:rPr>
+              <w:fldChar w:fldCharType="begin"/>
+            </w:r>
+            <w:r>
+              <w:rPr>
+                <w:noProof/>
+                <w:webHidden/>
+              </w:rPr>
+              <w:instrText xml:space="preserve"> PAGEREF _Toc231331308 \h </w:instrText>
+            </w:r>
+            <w:r>
+              <w:rPr>
+                <w:noProof/>
+                <w:webHidden/>
+              </w:rPr>
+            </w:r>
+            <w:r>
+              <w:rPr>
+                <w:noProof/>
+                <w:webHidden/>
+              </w:rPr>
+              <w:fldChar w:fldCharType="separate"/>
+            </w:r>
+            <w:r>
+              <w:rPr>
+                <w:noProof/>
+                <w:webHidden/>
+              </w:rPr>
+              <w:t>11</w:t>
+            </w:r>
+            <w:r>
+              <w:rPr>
+                <w:noProof/>
+                <w:webHidden/>
+              </w:rPr>
+              <w:fldChar w:fldCharType="end"/>
+            </w:r>
+          </w:hyperlink>
+        </w:p>
+        <w:p>
+          <w:pPr>
+            <w:pStyle w:val="TM3"/>
+            <w:tabs>
+              <w:tab w:val="left" w:pos="960"/>
+              <w:tab w:val="right" w:leader="dot" w:pos="10055"/>
+            </w:tabs>
+            <w:rPr>
+              <w:rFonts w:asciiTheme="minorHAnsi" w:eastAsiaTheme="minorEastAsia" w:hAnsiTheme="minorHAnsi" w:cstheme="minorBidi"/>
+              <w:noProof/>
+              <w:kern w:val="2"/>
+              <w:szCs w:val="24"/>
+              <w:lang w:eastAsia="fr-FR" w:bidi="ar-SA"/>
+              <w14:ligatures w14:val="standardContextual"/>
+            </w:rPr>
+          </w:pPr>
+          <w:hyperlink w:anchor="_Toc231331309" w:history="1">
+            <w:r>
+              <w:rPr>
+                <w:rStyle w:val="Lienhypertexte"/>
+                <w:noProof/>
+              </w:rPr>
+              <w:t>a)</w:t>
+            </w:r>
+            <w:r>
+              <w:rPr>
+                <w:rFonts w:asciiTheme="minorHAnsi" w:eastAsiaTheme="minorEastAsia" w:hAnsiTheme="minorHAnsi" w:cstheme="minorBidi"/>
+                <w:noProof/>
+                <w:kern w:val="2"/>
+                <w:szCs w:val="24"/>
+                <w:lang w:eastAsia="fr-FR" w:bidi="ar-SA"/>
+                <w14:ligatures w14:val="standardContextual"/>
+              </w:rPr>
+              <w:tab/>
+            </w:r>
+            <w:r>
+              <w:rPr>
+                <w:rStyle w:val="Lienhypertexte"/>
+                <w:noProof/>
+              </w:rPr>
+              <w:t>Explication sur l’exécution</w:t>
+            </w:r>
+            <w:r>
+              <w:rPr>
+                <w:noProof/>
+                <w:webHidden/>
+              </w:rPr>
+              <w:tab/>
+            </w:r>
+            <w:r>
+              <w:rPr>
+                <w:noProof/>
+                <w:webHidden/>
+              </w:rPr>
+              <w:fldChar w:fldCharType="begin"/>
+            </w:r>
+            <w:r>
+              <w:rPr>
+                <w:noProof/>
+                <w:webHidden/>
+              </w:rPr>
+              <w:instrText xml:space="preserve"> PAGEREF _Toc231331309 \h </w:instrText>
+            </w:r>
+            <w:r>
+              <w:rPr>
+                <w:noProof/>
+                <w:webHidden/>
+              </w:rPr>
+            </w:r>
+            <w:r>
+              <w:rPr>
+                <w:noProof/>
+                <w:webHidden/>
+              </w:rPr>
+              <w:fldChar w:fldCharType="separate"/>
+            </w:r>
+            <w:r>
+              <w:rPr>
+                <w:noProof/>
+                <w:webHidden/>
+              </w:rPr>
+              <w:t>12</w:t>
+            </w:r>
+            <w:r>
+              <w:rPr>
+                <w:noProof/>
+                <w:webHidden/>
+              </w:rPr>
+              <w:fldChar w:fldCharType="end"/>
+            </w:r>
+          </w:hyperlink>
+        </w:p>
+        <w:p>
+          <w:pPr>
+            <w:pStyle w:val="TM2"/>
+            <w:tabs>
+              <w:tab w:val="left" w:pos="960"/>
+              <w:tab w:val="right" w:leader="dot" w:pos="10055"/>
+            </w:tabs>
+            <w:rPr>
+              <w:rFonts w:asciiTheme="minorHAnsi" w:eastAsiaTheme="minorEastAsia" w:hAnsiTheme="minorHAnsi" w:cstheme="minorBidi"/>
+              <w:noProof/>
+              <w:kern w:val="2"/>
+              <w:szCs w:val="24"/>
+              <w:lang w:eastAsia="fr-FR" w:bidi="ar-SA"/>
+              <w14:ligatures w14:val="standardContextual"/>
+            </w:rPr>
+          </w:pPr>
+          <w:hyperlink w:anchor="_Toc231331310" w:history="1">
+            <w:r>
+              <w:rPr>
+                <w:rStyle w:val="Lienhypertexte"/>
+                <w:noProof/>
+              </w:rPr>
+              <w:t>3.2.</w:t>
+            </w:r>
+            <w:r>
+              <w:rPr>
+                <w:rFonts w:asciiTheme="minorHAnsi" w:eastAsiaTheme="minorEastAsia" w:hAnsiTheme="minorHAnsi" w:cstheme="minorBidi"/>
+                <w:noProof/>
+                <w:kern w:val="2"/>
+                <w:szCs w:val="24"/>
+                <w:lang w:eastAsia="fr-FR" w:bidi="ar-SA"/>
+                <w14:ligatures w14:val="standardContextual"/>
+              </w:rPr>
+              <w:tab/>
+            </w:r>
+            <w:r>
+              <w:rPr>
+                <w:rStyle w:val="Lienhypertexte"/>
+                <w:noProof/>
+              </w:rPr>
+              <w:t>Test #2 – Cas simple</w:t>
+            </w:r>
+            <w:r>
+              <w:rPr>
+                <w:noProof/>
+                <w:webHidden/>
+              </w:rPr>
+              <w:tab/>
+            </w:r>
+            <w:r>
+              <w:rPr>
+                <w:noProof/>
+                <w:webHidden/>
+              </w:rPr>
+              <w:fldChar w:fldCharType="begin"/>
+            </w:r>
+            <w:r>
+              <w:rPr>
+                <w:noProof/>
+                <w:webHidden/>
+              </w:rPr>
+              <w:instrText xml:space="preserve"> PAGEREF _Toc231331310 \h </w:instrText>
+            </w:r>
+            <w:r>
+              <w:rPr>
+                <w:noProof/>
+                <w:webHidden/>
+              </w:rPr>
+            </w:r>
+            <w:r>
+              <w:rPr>
+                <w:noProof/>
+                <w:webHidden/>
+              </w:rPr>
+              <w:fldChar w:fldCharType="separate"/>
+            </w:r>
+            <w:r>
+              <w:rPr>
+                <w:noProof/>
+                <w:webHidden/>
+              </w:rPr>
+              <w:t>14</w:t>
+            </w:r>
+            <w:r>
+              <w:rPr>
+                <w:noProof/>
+                <w:webHidden/>
+              </w:rPr>
+              <w:fldChar w:fldCharType="end"/>
+            </w:r>
+          </w:hyperlink>
+        </w:p>
+        <w:p>
+          <w:pPr>
+            <w:pStyle w:val="TM2"/>
+            <w:tabs>
+              <w:tab w:val="left" w:pos="960"/>
+              <w:tab w:val="right" w:leader="dot" w:pos="10055"/>
+            </w:tabs>
+            <w:rPr>
+              <w:rFonts w:asciiTheme="minorHAnsi" w:eastAsiaTheme="minorEastAsia" w:hAnsiTheme="minorHAnsi" w:cstheme="minorBidi"/>
+              <w:noProof/>
+              <w:kern w:val="2"/>
+              <w:szCs w:val="24"/>
+              <w:lang w:eastAsia="fr-FR" w:bidi="ar-SA"/>
+              <w14:ligatures w14:val="standardContextual"/>
+            </w:rPr>
+          </w:pPr>
+          <w:hyperlink w:anchor="_Toc231331311" w:history="1">
+            <w:r>
+              <w:rPr>
+                <w:rStyle w:val="Lienhypertexte"/>
+                <w:noProof/>
+              </w:rPr>
+              <w:t>3.3.</w:t>
+            </w:r>
+            <w:r>
+              <w:rPr>
+                <w:rFonts w:asciiTheme="minorHAnsi" w:eastAsiaTheme="minorEastAsia" w:hAnsiTheme="minorHAnsi" w:cstheme="minorBidi"/>
+                <w:noProof/>
+                <w:kern w:val="2"/>
+                <w:szCs w:val="24"/>
+                <w:lang w:eastAsia="fr-FR" w:bidi="ar-SA"/>
+                <w14:ligatures w14:val="standardContextual"/>
+              </w:rPr>
+              <w:tab/>
+            </w:r>
+            <w:r>
+              <w:rPr>
+                <w:rStyle w:val="Lienhypertexte"/>
+                <w:noProof/>
+              </w:rPr>
+              <w:t>Test #3 – 1</w:t>
+            </w:r>
+            <w:r>
+              <w:rPr>
+                <w:rStyle w:val="Lienhypertexte"/>
+                <w:noProof/>
+                <w:vertAlign w:val="superscript"/>
+              </w:rPr>
+              <w:t>er</w:t>
+            </w:r>
+            <w:r>
+              <w:rPr>
+                <w:rStyle w:val="Lienhypertexte"/>
+                <w:noProof/>
+              </w:rPr>
+              <w:t xml:space="preserve"> pivot à 0</w:t>
+            </w:r>
+            <w:r>
+              <w:rPr>
+                <w:noProof/>
+                <w:webHidden/>
+              </w:rPr>
+              <w:tab/>
+            </w:r>
+            <w:r>
+              <w:rPr>
+                <w:noProof/>
+                <w:webHidden/>
+              </w:rPr>
+              <w:fldChar w:fldCharType="begin"/>
+            </w:r>
+            <w:r>
+              <w:rPr>
+                <w:noProof/>
+                <w:webHidden/>
+              </w:rPr>
+              <w:instrText xml:space="preserve"> PAGEREF _Toc231331311 \h </w:instrText>
+            </w:r>
+            <w:r>
+              <w:rPr>
+                <w:noProof/>
+                <w:webHidden/>
+              </w:rPr>
+            </w:r>
+            <w:r>
+              <w:rPr>
+                <w:noProof/>
+                <w:webHidden/>
+              </w:rPr>
+              <w:fldChar w:fldCharType="separate"/>
+            </w:r>
+            <w:r>
+              <w:rPr>
+                <w:noProof/>
+                <w:webHidden/>
+              </w:rPr>
+              <w:t>15</w:t>
+            </w:r>
+            <w:r>
+              <w:rPr>
+                <w:noProof/>
+                <w:webHidden/>
+              </w:rPr>
+              <w:fldChar w:fldCharType="end"/>
+            </w:r>
+          </w:hyperlink>
+        </w:p>
+        <w:p>
+          <w:pPr>
+            <w:pStyle w:val="TM3"/>
+            <w:tabs>
+              <w:tab w:val="left" w:pos="960"/>
+              <w:tab w:val="right" w:leader="dot" w:pos="10055"/>
+            </w:tabs>
+            <w:rPr>
+              <w:rFonts w:asciiTheme="minorHAnsi" w:eastAsiaTheme="minorEastAsia" w:hAnsiTheme="minorHAnsi" w:cstheme="minorBidi"/>
+              <w:noProof/>
+              <w:kern w:val="2"/>
+              <w:szCs w:val="24"/>
+              <w:lang w:eastAsia="fr-FR" w:bidi="ar-SA"/>
+              <w14:ligatures w14:val="standardContextual"/>
+            </w:rPr>
+          </w:pPr>
+          <w:hyperlink w:anchor="_Toc231331312" w:history="1">
+            <w:r>
+              <w:rPr>
+                <w:rStyle w:val="Lienhypertexte"/>
+                <w:noProof/>
+              </w:rPr>
+              <w:t>a)</w:t>
+            </w:r>
+            <w:r>
+              <w:rPr>
+                <w:rFonts w:asciiTheme="minorHAnsi" w:eastAsiaTheme="minorEastAsia" w:hAnsiTheme="minorHAnsi" w:cstheme="minorBidi"/>
+                <w:noProof/>
+                <w:kern w:val="2"/>
+                <w:szCs w:val="24"/>
+                <w:lang w:eastAsia="fr-FR" w:bidi="ar-SA"/>
+                <w14:ligatures w14:val="standardContextual"/>
+              </w:rPr>
+              <w:tab/>
+            </w:r>
+            <w:r>
+              <w:rPr>
+                <w:rStyle w:val="Lienhypertexte"/>
+                <w:noProof/>
+              </w:rPr>
+              <w:t>Explication sur l’exécution :</w:t>
+            </w:r>
+            <w:r>
+              <w:rPr>
+                <w:noProof/>
+                <w:webHidden/>
+              </w:rPr>
+              <w:tab/>
+            </w:r>
+            <w:r>
+              <w:rPr>
+                <w:noProof/>
+                <w:webHidden/>
+              </w:rPr>
+              <w:fldChar w:fldCharType="begin"/>
+            </w:r>
+            <w:r>
+              <w:rPr>
+                <w:noProof/>
+                <w:webHidden/>
+              </w:rPr>
+              <w:instrText xml:space="preserve"> PAGEREF _Toc231331312 \h </w:instrText>
+            </w:r>
+            <w:r>
+              <w:rPr>
+                <w:noProof/>
+                <w:webHidden/>
+              </w:rPr>
+            </w:r>
+            <w:r>
+              <w:rPr>
+                <w:noProof/>
+                <w:webHidden/>
+              </w:rPr>
+              <w:fldChar w:fldCharType="separate"/>
+            </w:r>
+            <w:r>
+              <w:rPr>
+                <w:noProof/>
+                <w:webHidden/>
+              </w:rPr>
+              <w:t>15</w:t>
+            </w:r>
+            <w:r>
+              <w:rPr>
+                <w:noProof/>
+                <w:webHidden/>
+              </w:rPr>
+              <w:fldChar w:fldCharType="end"/>
+            </w:r>
+          </w:hyperlink>
+        </w:p>
+        <w:p>
+          <w:pPr>
+            <w:pStyle w:val="TM2"/>
+            <w:tabs>
+              <w:tab w:val="left" w:pos="960"/>
+              <w:tab w:val="right" w:leader="dot" w:pos="10055"/>
+            </w:tabs>
+            <w:rPr>
+              <w:rFonts w:asciiTheme="minorHAnsi" w:eastAsiaTheme="minorEastAsia" w:hAnsiTheme="minorHAnsi" w:cstheme="minorBidi"/>
+              <w:noProof/>
+              <w:kern w:val="2"/>
+              <w:szCs w:val="24"/>
+              <w:lang w:eastAsia="fr-FR" w:bidi="ar-SA"/>
+              <w14:ligatures w14:val="standardContextual"/>
+            </w:rPr>
+          </w:pPr>
+          <w:hyperlink w:anchor="_Toc231331313" w:history="1">
+            <w:r>
+              <w:rPr>
+                <w:rStyle w:val="Lienhypertexte"/>
+                <w:noProof/>
+              </w:rPr>
+              <w:t>3.4.</w:t>
+            </w:r>
+            <w:r>
+              <w:rPr>
+                <w:rFonts w:asciiTheme="minorHAnsi" w:eastAsiaTheme="minorEastAsia" w:hAnsiTheme="minorHAnsi" w:cstheme="minorBidi"/>
+                <w:noProof/>
+                <w:kern w:val="2"/>
+                <w:szCs w:val="24"/>
+                <w:lang w:eastAsia="fr-FR" w:bidi="ar-SA"/>
+                <w14:ligatures w14:val="standardContextual"/>
+              </w:rPr>
+              <w:tab/>
+            </w:r>
+            <w:r>
+              <w:rPr>
+                <w:rStyle w:val="Lienhypertexte"/>
+                <w:noProof/>
+              </w:rPr>
+              <w:t>Test #4 – Le 2</w:t>
+            </w:r>
+            <w:r>
+              <w:rPr>
+                <w:rStyle w:val="Lienhypertexte"/>
+                <w:noProof/>
+                <w:vertAlign w:val="superscript"/>
+              </w:rPr>
+              <w:t>nd</w:t>
+            </w:r>
+            <w:r>
+              <w:rPr>
+                <w:rStyle w:val="Lienhypertexte"/>
+                <w:noProof/>
+              </w:rPr>
+              <w:t xml:space="preserve"> pivot à 0 après élimination</w:t>
+            </w:r>
+            <w:r>
+              <w:rPr>
+                <w:noProof/>
+                <w:webHidden/>
+              </w:rPr>
+              <w:tab/>
+            </w:r>
+            <w:r>
+              <w:rPr>
+                <w:noProof/>
+                <w:webHidden/>
+              </w:rPr>
+              <w:fldChar w:fldCharType="begin"/>
+            </w:r>
+            <w:r>
+              <w:rPr>
+                <w:noProof/>
+                <w:webHidden/>
+              </w:rPr>
+              <w:instrText xml:space="preserve"> PAGEREF _Toc231331313 \h </w:instrText>
+            </w:r>
+            <w:r>
+              <w:rPr>
+                <w:noProof/>
+                <w:webHidden/>
+              </w:rPr>
+            </w:r>
+            <w:r>
+              <w:rPr>
+                <w:noProof/>
+                <w:webHidden/>
+              </w:rPr>
+              <w:fldChar w:fldCharType="separate"/>
+            </w:r>
+            <w:r>
+              <w:rPr>
+                <w:noProof/>
+                <w:webHidden/>
+              </w:rPr>
+              <w:t>16</w:t>
+            </w:r>
+            <w:r>
+              <w:rPr>
+                <w:noProof/>
+                <w:webHidden/>
+              </w:rPr>
+              <w:fldChar w:fldCharType="end"/>
+            </w:r>
+          </w:hyperlink>
+        </w:p>
+        <w:p>
+          <w:pPr>
+            <w:pStyle w:val="TM3"/>
+            <w:tabs>
+              <w:tab w:val="left" w:pos="960"/>
+              <w:tab w:val="right" w:leader="dot" w:pos="10055"/>
+            </w:tabs>
+            <w:rPr>
+              <w:rFonts w:asciiTheme="minorHAnsi" w:eastAsiaTheme="minorEastAsia" w:hAnsiTheme="minorHAnsi" w:cstheme="minorBidi"/>
+              <w:noProof/>
+              <w:kern w:val="2"/>
+              <w:szCs w:val="24"/>
+              <w:lang w:eastAsia="fr-FR" w:bidi="ar-SA"/>
+              <w14:ligatures w14:val="standardContextual"/>
+            </w:rPr>
+          </w:pPr>
+          <w:hyperlink w:anchor="_Toc231331314" w:history="1">
+            <w:r>
+              <w:rPr>
+                <w:rStyle w:val="Lienhypertexte"/>
+                <w:noProof/>
+              </w:rPr>
+              <w:t>a)</w:t>
+            </w:r>
+            <w:r>
+              <w:rPr>
+                <w:rFonts w:asciiTheme="minorHAnsi" w:eastAsiaTheme="minorEastAsia" w:hAnsiTheme="minorHAnsi" w:cstheme="minorBidi"/>
+                <w:noProof/>
+                <w:kern w:val="2"/>
+                <w:szCs w:val="24"/>
+                <w:lang w:eastAsia="fr-FR" w:bidi="ar-SA"/>
+                <w14:ligatures w14:val="standardContextual"/>
+              </w:rPr>
+              <w:tab/>
+            </w:r>
+            <w:r>
+              <w:rPr>
+                <w:rStyle w:val="Lienhypertexte"/>
+                <w:noProof/>
+              </w:rPr>
+              <w:t>Explication sur l’exécution :</w:t>
+            </w:r>
+            <w:r>
+              <w:rPr>
+                <w:noProof/>
+                <w:webHidden/>
+              </w:rPr>
+              <w:tab/>
+            </w:r>
+            <w:r>
+              <w:rPr>
+                <w:noProof/>
+                <w:webHidden/>
+              </w:rPr>
+              <w:fldChar w:fldCharType="begin"/>
+            </w:r>
+            <w:r>
+              <w:rPr>
+                <w:noProof/>
+                <w:webHidden/>
+              </w:rPr>
+              <w:instrText xml:space="preserve"> PAGEREF _Toc231331314 \h </w:instrText>
+            </w:r>
+            <w:r>
+              <w:rPr>
+                <w:noProof/>
+                <w:webHidden/>
+              </w:rPr>
+            </w:r>
+            <w:r>
+              <w:rPr>
+                <w:noProof/>
+                <w:webHidden/>
+              </w:rPr>
+              <w:fldChar w:fldCharType="separate"/>
+            </w:r>
+            <w:r>
+              <w:rPr>
+                <w:noProof/>
+                <w:webHidden/>
+              </w:rPr>
+              <w:t>17</w:t>
+            </w:r>
+            <w:r>
+              <w:rPr>
+                <w:noProof/>
+                <w:webHidden/>
+              </w:rPr>
+              <w:fldChar w:fldCharType="end"/>
+            </w:r>
+          </w:hyperlink>
+        </w:p>
+        <w:p>
+          <w:pPr>
+            <w:pStyle w:val="TM2"/>
+            <w:tabs>
+              <w:tab w:val="left" w:pos="960"/>
+              <w:tab w:val="right" w:leader="dot" w:pos="10055"/>
+            </w:tabs>
+            <w:rPr>
+              <w:rFonts w:asciiTheme="minorHAnsi" w:eastAsiaTheme="minorEastAsia" w:hAnsiTheme="minorHAnsi" w:cstheme="minorBidi"/>
+              <w:noProof/>
+              <w:kern w:val="2"/>
+              <w:szCs w:val="24"/>
+              <w:lang w:eastAsia="fr-FR" w:bidi="ar-SA"/>
+              <w14:ligatures w14:val="standardContextual"/>
+            </w:rPr>
+          </w:pPr>
+          <w:hyperlink w:anchor="_Toc231331315" w:history="1">
+            <w:r>
+              <w:rPr>
+                <w:rStyle w:val="Lienhypertexte"/>
+                <w:noProof/>
+              </w:rPr>
+              <w:t>3.5.</w:t>
+            </w:r>
+            <w:r>
+              <w:rPr>
+                <w:rFonts w:asciiTheme="minorHAnsi" w:eastAsiaTheme="minorEastAsia" w:hAnsiTheme="minorHAnsi" w:cstheme="minorBidi"/>
+                <w:noProof/>
+                <w:kern w:val="2"/>
+                <w:szCs w:val="24"/>
+                <w:lang w:eastAsia="fr-FR" w:bidi="ar-SA"/>
+                <w14:ligatures w14:val="standardContextual"/>
+              </w:rPr>
+              <w:tab/>
+            </w:r>
+            <w:r>
+              <w:rPr>
+                <w:rStyle w:val="Lienhypertexte"/>
+                <w:noProof/>
+              </w:rPr>
+              <w:t>Test #5 – Le dernier pivot à 0</w:t>
+            </w:r>
+            <w:r>
+              <w:rPr>
+                <w:noProof/>
+                <w:webHidden/>
+              </w:rPr>
+              <w:tab/>
+            </w:r>
+            <w:r>
+              <w:rPr>
+                <w:noProof/>
+                <w:webHidden/>
+              </w:rPr>
+              <w:fldChar w:fldCharType="begin"/>
+            </w:r>
+            <w:r>
+              <w:rPr>
+                <w:noProof/>
+                <w:webHidden/>
+              </w:rPr>
+              <w:instrText xml:space="preserve"> PAGEREF _Toc231331315 \h </w:instrText>
+            </w:r>
+            <w:r>
+              <w:rPr>
+                <w:noProof/>
+                <w:webHidden/>
+              </w:rPr>
+            </w:r>
+            <w:r>
+              <w:rPr>
+                <w:noProof/>
+                <w:webHidden/>
+              </w:rPr>
+              <w:fldChar w:fldCharType="separate"/>
+            </w:r>
+            <w:r>
+              <w:rPr>
+                <w:noProof/>
+                <w:webHidden/>
+              </w:rPr>
+              <w:t>18</w:t>
+            </w:r>
+            <w:r>
+              <w:rPr>
+                <w:noProof/>
+                <w:webHidden/>
+              </w:rPr>
+              <w:fldChar w:fldCharType="end"/>
+            </w:r>
+          </w:hyperlink>
+        </w:p>
+        <w:p>
+          <w:r>
+            <w:rPr>
+              <w:b/>
+              <w:bCs/>
+            </w:rPr>
+            <w:fldChar w:fldCharType="end"/>
+          </w:r>
+        </w:p>
+      </w:sdtContent>
+    </w:sdt>
+    <w:p>
+      <w:pPr>
         <w:rPr>
           <w:sz w:val="50"/>
           <w:szCs w:val="50"/>
         </w:rPr>
+      </w:pPr>
+      <w:r>
+        <w:rPr>
+          <w:sz w:val="50"/>
+          <w:szCs w:val="50"/>
+        </w:rPr>
         <w:br w:type="page"/>
       </w:r>
     </w:p>
@@ -172,10 +1838,12 @@
       <w:pPr>
         <w:pStyle w:val="Titre1"/>
       </w:pPr>
+      <w:bookmarkStart w:id="0" w:name="_Toc231331299"/>
       <w:r>
         <w:lastRenderedPageBreak/>
         <w:t>Présentation</w:t>
       </w:r>
+      <w:bookmarkEnd w:id="0"/>
     </w:p>
     <w:p>
       <w:pPr>
@@ -513,7 +2181,7 @@
         <w:rPr>
           <w:rFonts w:ascii="Arial" w:hAnsi="Arial" w:cs="Arial"/>
         </w:rPr>
-        <w:t>exemple fournit dans le</w:t>
+        <w:t>exemple fourni dans le</w:t>
       </w:r>
       <w:r>
         <w:rPr>
@@ -622,7 +2290,13 @@
         <w:rPr>
           <w:rFonts w:ascii="Arial" w:hAnsi="Arial" w:cs="Arial"/>
         </w:rPr>
-        <w:t>à 0</w:t>
+        <w:t>égal à</w:t>
+      </w:r>
+      <w:r>
+        <w:rPr>
+          <w:rFonts w:ascii="Arial" w:hAnsi="Arial" w:cs="Arial"/>
+        </w:rPr>
+        <w:t xml:space="preserve"> 0</w:t>
       </w:r>
     </w:p>
     <w:p>
@@ -670,7 +2344,19 @@
         <w:rPr>
           <w:rFonts w:ascii="Arial" w:hAnsi="Arial" w:cs="Arial"/>
         </w:rPr>
-        <w:t>Cas lorsque le dernier pivot est 0</w:t>
+        <w:t xml:space="preserve">Cas lorsque le dernier pivot </w:t>
+      </w:r>
+      <w:r>
+        <w:rPr>
+          <w:rFonts w:ascii="Arial" w:hAnsi="Arial" w:cs="Arial"/>
+        </w:rPr>
+        <w:t>égal à</w:t>
+      </w:r>
+      <w:r>
+        <w:rPr>
+          <w:rFonts w:ascii="Arial" w:hAnsi="Arial" w:cs="Arial"/>
+        </w:rPr>
+        <w:t xml:space="preserve"> 0</w:t>
       </w:r>
     </w:p>
     <w:p>
@@ -848,16 +2534,14 @@
         <w:rPr>
           <w:rFonts w:ascii="Arial" w:hAnsi="Arial" w:cs="Arial"/>
         </w:rPr>
-        <w:t xml:space="preserve"> par 0 est </w:t>
-      </w:r>
-      <w:proofErr w:type="gramStart"/>
+        <w:t xml:space="preserve"> par 0 est réalisé</w:t>
+      </w:r>
       <w:r>
         <w:rPr>
           <w:rFonts w:ascii="Arial" w:hAnsi="Arial" w:cs="Arial"/>
         </w:rPr>
-        <w:t>réalisé</w:t>
-      </w:r>
-      <w:proofErr w:type="gramEnd"/>
+        <w:t>e</w:t>
+      </w:r>
       <w:r>
         <w:rPr>
           <w:rFonts w:ascii="Arial" w:hAnsi="Arial" w:cs="Arial"/>
@@ -964,19 +2648,10 @@
         </w:rPr>
         <w:t>PYTHON lors d’une division par 0</w:t>
       </w:r>
-    </w:p>
-    <w:p>
-      <w:pPr>
-        <w:pStyle w:val="Standard"/>
-        <w:jc w:val="both"/>
+      <w:r>
         <w:rPr>
           <w:rFonts w:ascii="Arial" w:hAnsi="Arial" w:cs="Arial"/>
         </w:rPr>
-      </w:pPr>
-      <w:r>
-        <w:rPr>
-          <w:rFonts w:ascii="Arial" w:hAnsi="Arial" w:cs="Arial"/>
-        </w:rPr>
         <w:br w:type="page"/>
       </w:r>
     </w:p>
@@ -984,18 +2659,22 @@
       <w:pPr>
         <w:pStyle w:val="Titre1"/>
       </w:pPr>
+      <w:bookmarkStart w:id="1" w:name="_Toc231331300"/>
       <w:r>
         <w:lastRenderedPageBreak/>
         <w:t>Exécution du programme écrit en C</w:t>
       </w:r>
+      <w:bookmarkEnd w:id="1"/>
     </w:p>
     <w:p>
       <w:pPr>
         <w:pStyle w:val="Titre2"/>
       </w:pPr>
+      <w:bookmarkStart w:id="2" w:name="_Toc231331301"/>
       <w:r>
         <w:t>Test #1 – Cas nominal</w:t>
       </w:r>
+      <w:bookmarkEnd w:id="2"/>
     </w:p>
     <w:p>
       <w:pPr>
@@ -1382,7 +3061,16 @@
         </w:drawing>
       </w:r>
       <w:r>
-        <w:t>Ses matrices sont ceux fournit dans l’énoncé du projet.</w:t>
+        <w:t>C</w:t>
+      </w:r>
+      <w:r>
+        <w:t>es matrices sont ceux fourni</w:t>
+      </w:r>
+      <w:r>
+        <w:t>es</w:t>
+      </w:r>
+      <w:r>
+        <w:t xml:space="preserve"> dans l’énoncé du projet.</w:t>
       </w:r>
     </w:p>
     <w:p>
@@ -1502,13 +3190,15 @@
       <w:pPr>
         <w:pStyle w:val="Titre3"/>
       </w:pPr>
+      <w:bookmarkStart w:id="3" w:name="_Toc231331302"/>
       <w:r>
         <w:lastRenderedPageBreak/>
         <w:t xml:space="preserve">Explication sur </w:t>
       </w:r>
       <w:r>
-        <w:t>l’exécution :</w:t>
-      </w:r>
+        <w:t>l’exécution</w:t>
+      </w:r>
+      <w:bookmarkEnd w:id="3"/>
     </w:p>
     <w:p>
       <w:pPr>
@@ -2350,7 +4040,10 @@
         <w:t xml:space="preserve">saisie </w:t>
       </w:r>
       <w:r>
-        <w:t>pour la « t</w:t>
+        <w:t>pour la « </w:t>
+      </w:r>
+      <w:r>
+        <w:t>T</w:t>
       </w:r>
       <w:r>
         <w:t>aille » correspondra la dimension de</w:t>
@@ -2365,7 +4058,13 @@
         <w:t>s</w:t>
       </w:r>
       <w:r>
-        <w:t xml:space="preserve"> carrée.</w:t>
+        <w:t xml:space="preserve"> carrée</w:t>
+      </w:r>
+      <w:r>
+        <w:t>s</w:t>
+      </w:r>
+      <w:r>
+        <w:t>.</w:t>
       </w:r>
     </w:p>
     <w:p>
@@ -2380,7 +4079,10 @@
         <w:t xml:space="preserve">Pour les matrices b, y et x, la taille permet de définir également la taille de </w:t>
       </w:r>
       <w:r>
-        <w:t>ses matrices</w:t>
+        <w:t>c</w:t>
+      </w:r>
+      <w:r>
+        <w:t>es matrices</w:t>
       </w:r>
       <w:r>
         <w:t xml:space="preserve"> mais à une seule colonne.</w:t>
@@ -2415,17 +4117,12 @@
         <w:t xml:space="preserve"> Cela dit, mes recherches m’ont amené à voir qu’il existe des fonctions d’allocation mémoire dynamique à l’aide de la fonction </w:t>
       </w:r>
       <w:proofErr w:type="spellStart"/>
-      <w:proofErr w:type="gramStart"/>
       <w:r>
         <w:t>malloc</w:t>
       </w:r>
       <w:proofErr w:type="spellEnd"/>
       <w:r>
-        <w:t>(</w:t>
-      </w:r>
-      <w:proofErr w:type="gramEnd"/>
-      <w:r>
-        <w:t>).</w:t>
+        <w:t>().</w:t>
       </w:r>
     </w:p>
     <w:p>
@@ -2477,7 +4174,6 @@
         <w:t xml:space="preserve">Ce tableau est de la forme suivante : </w:t>
       </w:r>
       <w:proofErr w:type="spellStart"/>
-      <w:proofErr w:type="gramStart"/>
       <w:r>
         <w:t>Matrice</w:t>
       </w:r>
@@ -2486,11 +4182,7 @@
       </w:r>
       <w:proofErr w:type="spellEnd"/>
       <w:r>
-        <w:t>[</w:t>
-      </w:r>
-      <w:proofErr w:type="gramEnd"/>
-      <w:r>
-        <w:t>Ligne][Colonne]</w:t>
+        <w:t>[Ligne][Colonne]</w:t>
       </w:r>
       <w:r>
         <w:t>. En C</w:t>
@@ -4090,14 +5782,16 @@
       <w:pPr>
         <w:pStyle w:val="Titre2"/>
       </w:pPr>
+      <w:bookmarkStart w:id="4" w:name="_Toc231331303"/>
       <w:r>
         <w:lastRenderedPageBreak/>
         <w:t>Test #2 – Cas simple</w:t>
       </w:r>
-    </w:p>
-    <w:p>
-      <w:r>
-        <w:t>Ce test permet à ce que le programme se déroule sans défaut, c’est-à-dire qu’aucun pivot à 0, qu</w:t>
+      <w:bookmarkEnd w:id="4"/>
+    </w:p>
+    <w:p>
+      <w:r>
+        <w:t>Ce test permet que le programme se déroule sans défaut, c’est-à-dire qu’aucun pivot à 0, qu</w:t>
       </w:r>
       <w:r>
         <w:t xml:space="preserve">’il permet </w:t>
@@ -4567,6 +6261,7 @@
       <w:pPr>
         <w:pStyle w:val="Titre2"/>
       </w:pPr>
+      <w:bookmarkStart w:id="5" w:name="_Toc231331304"/>
       <w:r>
         <w:lastRenderedPageBreak/>
         <w:t xml:space="preserve">Test#2 </w:t>
@@ -4589,6 +6284,7 @@
       <w:r>
         <w:t xml:space="preserve"> pivot à 0</w:t>
       </w:r>
+      <w:bookmarkEnd w:id="5"/>
     </w:p>
     <w:p>
       <w:pPr>
@@ -4941,6 +6637,7 @@
       <w:pPr>
         <w:pStyle w:val="Titre2"/>
       </w:pPr>
+      <w:bookmarkStart w:id="6" w:name="_Toc231331305"/>
       <w:r>
         <w:lastRenderedPageBreak/>
         <w:t>Test#3 – Le 2</w:t>
@@ -4960,6 +6657,7 @@
       <w:r>
         <w:t xml:space="preserve"> après élimination</w:t>
       </w:r>
+      <w:bookmarkEnd w:id="6"/>
     </w:p>
     <w:p>
       <w:pPr>
@@ -5174,11 +6872,7 @@
         <w:t xml:space="preserve">le bon fonctionnement du programme lorsque </w:t>
       </w:r>
       <w:r>
-        <w:t xml:space="preserve">le pivot, par exemple après </w:t>
-      </w:r>
-      <w:proofErr w:type="gramStart"/>
-      <w:r>
-        <w:t>la 1</w:t>
+        <w:t>le pivot, par exemple après la 1</w:t>
       </w:r>
       <w:r>
         <w:rPr>
@@ -5187,11 +6881,7 @@
         <w:t>ère</w:t>
       </w:r>
       <w:r>
-        <w:t xml:space="preserve"> soustraction réalisé</w:t>
-      </w:r>
-      <w:proofErr w:type="gramEnd"/>
-      <w:r>
-        <w:t>, est un pivot à 0.</w:t>
+        <w:t xml:space="preserve"> soustraction réalisé, est un pivot à 0.</w:t>
       </w:r>
     </w:p>
     <w:p>
@@ -5199,7 +6889,13 @@
         <w:pStyle w:val="Textbody"/>
       </w:pPr>
       <w:r>
-        <w:t>Le premier pivot vaudra 1, mais</w:t>
+        <w:t xml:space="preserve">Le premier pivot </w:t>
+      </w:r>
+      <w:r>
+        <w:t xml:space="preserve">réalisé </w:t>
+      </w:r>
+      <w:r>
+        <w:t>vaudra 1, mais</w:t>
       </w:r>
       <w:r>
         <w:t xml:space="preserve"> </w:t>
@@ -5300,6 +6996,7 @@
       <w:pPr>
         <w:pStyle w:val="Titre2"/>
       </w:pPr>
+      <w:bookmarkStart w:id="7" w:name="_Toc231331306"/>
       <w:r>
         <w:lastRenderedPageBreak/>
         <w:t>Test #4 – Le dernier pivot</w:t>
@@ -5307,6 +7004,7 @@
       <w:r>
         <w:t xml:space="preserve"> à 0</w:t>
       </w:r>
+      <w:bookmarkEnd w:id="7"/>
     </w:p>
     <w:p>
       <w:pPr>
@@ -5658,18 +7356,22 @@
       <w:pPr>
         <w:pStyle w:val="Titre1"/>
       </w:pPr>
+      <w:bookmarkStart w:id="8" w:name="_Toc231331307"/>
       <w:r>
         <w:lastRenderedPageBreak/>
         <w:t>Exécution du programme écrit en PYTHON</w:t>
       </w:r>
+      <w:bookmarkEnd w:id="8"/>
     </w:p>
     <w:p>
       <w:pPr>
         <w:pStyle w:val="Titre2"/>
       </w:pPr>
+      <w:bookmarkStart w:id="9" w:name="_Toc231331308"/>
       <w:r>
         <w:t>Test #1 – Cas nominal</w:t>
       </w:r>
+      <w:bookmarkEnd w:id="9"/>
     </w:p>
     <w:p>
       <w:pPr>
@@ -6058,20 +7760,26 @@
       <w:pPr>
         <w:pStyle w:val="Titre3"/>
       </w:pPr>
+      <w:bookmarkStart w:id="10" w:name="_Toc231331309"/>
       <w:r>
         <w:lastRenderedPageBreak/>
-        <w:t>Explication sur l’exécution :</w:t>
-      </w:r>
-    </w:p>
-    <w:p>
-      <w:r>
-        <w:t xml:space="preserve">La première étape du programme consiste à inviter l’utilisateur à saisir une taille qui correspond </w:t>
-      </w:r>
-      <w:proofErr w:type="gramStart"/>
-      <w:r>
-        <w:t>au taille</w:t>
-      </w:r>
-      <w:proofErr w:type="gramEnd"/>
+        <w:t>Explication sur l’exécution</w:t>
+      </w:r>
+      <w:bookmarkEnd w:id="10"/>
+    </w:p>
+    <w:p>
+      <w:r>
+        <w:t>La première étape du programme consiste à inviter l’utilisateur à saisir une taille qui correspond au</w:t>
+      </w:r>
+      <w:r>
+        <w:t xml:space="preserve">x </w:t>
+      </w:r>
+      <w:r>
+        <w:t>taille</w:t>
+      </w:r>
+      <w:r>
+        <w:t>s</w:t>
+      </w:r>
       <w:r>
         <w:t xml:space="preserve"> des matrices.</w:t>
       </w:r>
@@ -6184,7 +7892,6 @@
         <w:t xml:space="preserve"> et </w:t>
       </w:r>
       <w:proofErr w:type="spellStart"/>
-      <w:proofErr w:type="gramStart"/>
       <w:r>
         <w:t>Matriceb</w:t>
       </w:r>
@@ -6192,7 +7899,6 @@
       <w:r>
         <w:t>:</w:t>
       </w:r>
-      <w:proofErr w:type="gramEnd"/>
     </w:p>
     <w:p>
       <w:r>
@@ -6271,7 +7977,13 @@
       </w:r>
       <w:proofErr w:type="spellStart"/>
       <w:r>
-        <w:t>debug</w:t>
+        <w:t>d</w:t>
+      </w:r>
+      <w:r>
+        <w:t>é</w:t>
+      </w:r>
+      <w:r>
+        <w:t>bug</w:t>
       </w:r>
       <w:proofErr w:type="spellEnd"/>
       <w:r>
@@ -6323,7 +8035,7 @@
     <w:p/>
     <w:p>
       <w:r>
-        <w:t>Une fois que l’utilisateur a saisie chaque coefficient</w:t>
+        <w:t>Une fois que l’utilisateur a saisi chaque coefficient</w:t>
       </w:r>
       <w:r>
         <w:t>,</w:t>
@@ -6430,7 +8142,19 @@
           <w:noProof/>
         </w:rPr>
         <w:lastRenderedPageBreak/>
-        <w:t>Voici la représentation de la matrice A lorsqu ele programme est éxécuté en mode Debug :</w:t>
+        <w:t>Voici la représentation de la matrice A lorsque</w:t>
+      </w:r>
+      <w:r>
+        <w:rPr>
+          <w:noProof/>
+        </w:rPr>
+        <w:t xml:space="preserve"> </w:t>
+      </w:r>
+      <w:r>
+        <w:rPr>
+          <w:noProof/>
+        </w:rPr>
+        <w:t>le programme est éxécuté en mode Debug :</w:t>
       </w:r>
     </w:p>
     <w:p>
@@ -7029,14 +8753,16 @@
       <w:pPr>
         <w:pStyle w:val="Titre2"/>
       </w:pPr>
+      <w:bookmarkStart w:id="11" w:name="_Toc231331310"/>
       <w:r>
         <w:lastRenderedPageBreak/>
         <w:t>Test #2 – Cas simple</w:t>
       </w:r>
-    </w:p>
-    <w:p>
-      <w:r>
-        <w:t xml:space="preserve">Ce test permet à ce que le programme se déroule sans défaut, c’est-à-dire qu’aucun pivot à 0, qu’il permet </w:t>
+      <w:bookmarkEnd w:id="11"/>
+    </w:p>
+    <w:p>
+      <w:r>
+        <w:t xml:space="preserve">Ce test permet que le programme se déroule sans défaut, c’est-à-dire qu’aucun pivot à 0, qu’il permet </w:t>
       </w:r>
       <w:r>
         <w:t>une vraie décomposition</w:t>
@@ -7048,13 +8774,16 @@
     <w:p>
       <w:pPr>
         <w:pStyle w:val="Textbody"/>
-        <w:rPr>
-          <w:noProof/>
-        </w:rPr>
       </w:pPr>
       <w:r>
         <w:t xml:space="preserve">Pour ce test la matrice A et b sont les suivantes : </w:t>
       </w:r>
+    </w:p>
+    <w:p>
+      <w:pPr>
+        <w:pStyle w:val="Textbody"/>
+        <w:jc w:val="center"/>
+      </w:pPr>
       <m:oMath>
         <m:r>
           <w:rPr>
@@ -7242,84 +8971,105 @@
         </m:d>
       </m:oMath>
       <w:r>
-        <w:t xml:space="preserve"> et la solution est la matrice x suivante </w:t>
-      </w:r>
-      <m:oMath>
-        <m:r>
-          <w:rPr>
-            <w:rFonts w:ascii="Cambria Math" w:hAnsi="Cambria Math"/>
-          </w:rPr>
-          <m:t>x=</m:t>
-        </m:r>
-        <m:d>
-          <m:dPr>
-            <m:begChr m:val="["/>
-            <m:endChr m:val="]"/>
-            <m:ctrlPr>
-              <w:rPr>
-                <w:rFonts w:ascii="Cambria Math" w:hAnsi="Cambria Math"/>
-                <w:i/>
-              </w:rPr>
-            </m:ctrlPr>
-          </m:dPr>
-          <m:e>
-            <m:m>
-              <m:mPr>
-                <m:mcs>
-                  <m:mc>
-                    <m:mcPr>
-                      <m:count m:val="1"/>
-                      <m:mcJc m:val="center"/>
-                    </m:mcPr>
-                  </m:mc>
-                </m:mcs>
-                <m:ctrlPr>
-                  <w:rPr>
-                    <w:rFonts w:ascii="Cambria Math" w:hAnsi="Cambria Math"/>
-                    <w:i/>
-                  </w:rPr>
-                </m:ctrlPr>
-              </m:mPr>
-              <m:mr>
-                <m:e>
-                  <m:r>
+        <w:t xml:space="preserve"> </w:t>
+      </w:r>
+    </w:p>
+    <w:p>
+      <w:pPr>
+        <w:pStyle w:val="Textbody"/>
+      </w:pPr>
+      <w:r>
+        <w:t>E</w:t>
+      </w:r>
+      <w:r>
+        <w:t xml:space="preserve">t la solution est la matrice </w:t>
+      </w:r>
+      <w:r>
+        <w:t>s</w:t>
+      </w:r>
+      <w:r>
+        <w:t xml:space="preserve">uivante </w:t>
+      </w:r>
+    </w:p>
+    <w:p>
+      <w:pPr>
+        <w:pStyle w:val="Textbody"/>
+        <w:rPr>
+          <w:noProof/>
+        </w:rPr>
+      </w:pPr>
+      <m:oMathPara>
+        <m:oMath>
+          <m:r>
+            <w:rPr>
+              <w:rFonts w:ascii="Cambria Math" w:hAnsi="Cambria Math"/>
+            </w:rPr>
+            <m:t>x=</m:t>
+          </m:r>
+          <m:d>
+            <m:dPr>
+              <m:begChr m:val="["/>
+              <m:endChr m:val="]"/>
+              <m:ctrlPr>
+                <w:rPr>
+                  <w:rFonts w:ascii="Cambria Math" w:hAnsi="Cambria Math"/>
+                  <w:i/>
+                </w:rPr>
+              </m:ctrlPr>
+            </m:dPr>
+            <m:e>
+              <m:m>
+                <m:mPr>
+                  <m:mcs>
+                    <m:mc>
+                      <m:mcPr>
+                        <m:count m:val="1"/>
+                        <m:mcJc m:val="center"/>
+                      </m:mcPr>
+                    </m:mc>
+                  </m:mcs>
+                  <m:ctrlPr>
                     <w:rPr>
                       <w:rFonts w:ascii="Cambria Math" w:hAnsi="Cambria Math"/>
+                      <w:i/>
                     </w:rPr>
-                    <m:t>0</m:t>
-                  </m:r>
-                </m:e>
-              </m:mr>
-              <m:mr>
-                <m:e>
-                  <m:r>
-                    <w:rPr>
-                      <w:rFonts w:ascii="Cambria Math" w:hAnsi="Cambria Math"/>
-                    </w:rPr>
-                    <m:t>2</m:t>
-                  </m:r>
-                </m:e>
-              </m:mr>
-              <m:mr>
-                <m:e>
-                  <m:r>
-                    <w:rPr>
-                      <w:rFonts w:ascii="Cambria Math" w:hAnsi="Cambria Math"/>
-                    </w:rPr>
-                    <m:t>-1</m:t>
-                  </m:r>
-                </m:e>
-              </m:mr>
-            </m:m>
-          </m:e>
-        </m:d>
-      </m:oMath>
-      <w:r>
-        <w:rPr>
-          <w:noProof/>
-        </w:rPr>
-        <w:t xml:space="preserve"> </w:t>
-      </w:r>
+                  </m:ctrlPr>
+                </m:mPr>
+                <m:mr>
+                  <m:e>
+                    <m:r>
+                      <w:rPr>
+                        <w:rFonts w:ascii="Cambria Math" w:hAnsi="Cambria Math"/>
+                      </w:rPr>
+                      <m:t>0</m:t>
+                    </m:r>
+                  </m:e>
+                </m:mr>
+                <m:mr>
+                  <m:e>
+                    <m:r>
+                      <w:rPr>
+                        <w:rFonts w:ascii="Cambria Math" w:hAnsi="Cambria Math"/>
+                      </w:rPr>
+                      <m:t>2</m:t>
+                    </m:r>
+                  </m:e>
+                </m:mr>
+                <m:mr>
+                  <m:e>
+                    <m:r>
+                      <w:rPr>
+                        <w:rFonts w:ascii="Cambria Math" w:hAnsi="Cambria Math"/>
+                      </w:rPr>
+                      <m:t>-1</m:t>
+                    </m:r>
+                  </m:e>
+                </m:mr>
+              </m:m>
+            </m:e>
+          </m:d>
+        </m:oMath>
+      </m:oMathPara>
     </w:p>
     <w:p>
       <w:pPr>
@@ -7396,8 +9146,6 @@
       <w:r>
         <w:t xml:space="preserve"> </w:t>
       </w:r>
-    </w:p>
-    <w:p>
       <w:r>
         <w:br w:type="page"/>
       </w:r>
@@ -7406,6 +9154,7 @@
       <w:pPr>
         <w:pStyle w:val="Titre2"/>
       </w:pPr>
+      <w:bookmarkStart w:id="12" w:name="_Toc231331311"/>
       <w:r>
         <w:lastRenderedPageBreak/>
         <w:t>Test #3 – 1</w:t>
@@ -7419,14 +9168,21 @@
       <w:r>
         <w:t xml:space="preserve"> pivot à 0</w:t>
       </w:r>
+      <w:bookmarkEnd w:id="12"/>
     </w:p>
     <w:p>
       <w:pPr>
         <w:pStyle w:val="Textbody"/>
       </w:pPr>
       <w:r>
-        <w:t xml:space="preserve">Pour ce test la matrice A et b sont les suivantes : </w:t>
-      </w:r>
+        <w:t>Pour ce test la matrice A et b sont les suivantes :</w:t>
+      </w:r>
+    </w:p>
+    <w:p>
+      <w:pPr>
+        <w:pStyle w:val="Textbody"/>
+        <w:jc w:val="center"/>
+      </w:pPr>
       <m:oMath>
         <m:r>
           <w:rPr>
@@ -7622,13 +9378,11 @@
         <w:pStyle w:val="Textbody"/>
       </w:pPr>
       <w:r>
-        <w:t xml:space="preserve">Remarque, le contenu de la matrice b n’a pas d’importance car dans ce cas, le premier pivot correspond à 0 et donc le programme détecte ceci. Il affiche un message d’erreur et indique la position </w:t>
-      </w:r>
-      <w:proofErr w:type="gramStart"/>
-      <w:r>
-        <w:t>ou</w:t>
-      </w:r>
-      <w:proofErr w:type="gramEnd"/>
+        <w:t>Remarque, le contenu de la matrice b n’a pas d’importance car dans ce cas, le premier pivot correspond à 0 et donc le programme détecte ceci. Il affiche un message d’erreur et indique la position o</w:t>
+      </w:r>
+      <w:r>
+        <w:t>ù</w:t>
+      </w:r>
       <w:r>
         <w:t xml:space="preserve"> se trouve le problème dans la matrice U</w:t>
       </w:r>
@@ -7647,8 +9401,8 @@
           <w:noProof/>
         </w:rPr>
         <w:drawing>
-          <wp:inline distT="0" distB="0" distL="0" distR="0" wp14:anchorId="253121E5" wp14:editId="68EE0663">
-            <wp:extent cx="6236895" cy="3219450"/>
+          <wp:inline distT="0" distB="0" distL="0" distR="0" wp14:anchorId="253121E5" wp14:editId="7BEA83DE">
+            <wp:extent cx="5683325" cy="2933700"/>
             <wp:effectExtent l="0" t="0" r="0" b="0"/>
             <wp:docPr id="1269076534" name="Image 1"/>
             <wp:cNvGraphicFramePr>
@@ -7670,7 +9424,7 @@
                   <pic:spPr>
                     <a:xfrm>
                       <a:off x="0" y="0"/>
-                      <a:ext cx="6243273" cy="3222742"/>
+                      <a:ext cx="5703978" cy="2944361"/>
                     </a:xfrm>
                     <a:prstGeom prst="rect">
                       <a:avLst/>
@@ -7718,9 +9472,11 @@
       <w:pPr>
         <w:pStyle w:val="Titre3"/>
       </w:pPr>
+      <w:bookmarkStart w:id="13" w:name="_Toc231331312"/>
       <w:r>
         <w:t>Explication sur l’exécution :</w:t>
       </w:r>
+      <w:bookmarkEnd w:id="13"/>
     </w:p>
     <w:p>
       <w:pPr>
@@ -7729,13 +9485,17 @@
       <w:r>
         <w:t xml:space="preserve">Ce test permet de vérifier que le programme détecte bien les cas </w:t>
       </w:r>
-      <w:proofErr w:type="spellStart"/>
-      <w:r>
-        <w:t>ou</w:t>
-      </w:r>
-      <w:proofErr w:type="spellEnd"/>
-      <w:r>
-        <w:t xml:space="preserve"> le pivot est nul et donc détecté qu’une division par 0 est impossible.</w:t>
+      <w:r>
+        <w:t>où</w:t>
+      </w:r>
+      <w:r>
+        <w:t xml:space="preserve"> le pivot est nul et donc détect</w:t>
+      </w:r>
+      <w:r>
+        <w:t>e</w:t>
+      </w:r>
+      <w:r>
+        <w:t xml:space="preserve"> qu’une division par 0 est impossible.</w:t>
       </w:r>
     </w:p>
     <w:p>
@@ -7940,11 +9700,9 @@
       <w:r>
         <w:t xml:space="preserve">Voici les données des matrices au moment </w:t>
       </w:r>
-      <w:proofErr w:type="spellStart"/>
-      <w:r>
-        <w:t>ou</w:t>
-      </w:r>
-      <w:proofErr w:type="spellEnd"/>
+      <w:r>
+        <w:t>où</w:t>
+      </w:r>
       <w:r>
         <w:t xml:space="preserve"> le pivot à 0 est détecté :</w:t>
       </w:r>
@@ -8003,6 +9761,7 @@
       <w:pPr>
         <w:pStyle w:val="Titre2"/>
       </w:pPr>
+      <w:bookmarkStart w:id="14" w:name="_Toc231331313"/>
       <w:r>
         <w:lastRenderedPageBreak/>
         <w:t>Test #4 – Le 2</w:t>
@@ -8016,17 +9775,14 @@
       <w:r>
         <w:t xml:space="preserve"> pivot à 0 après élimination</w:t>
       </w:r>
+      <w:bookmarkEnd w:id="14"/>
     </w:p>
     <w:p>
       <w:pPr>
         <w:pStyle w:val="Textbody"/>
       </w:pPr>
       <w:r>
-        <w:t xml:space="preserve">Ce test permet de vérifier le bon fonctionnement du programme lorsque le pivot, par exemple après </w:t>
-      </w:r>
-      <w:proofErr w:type="gramStart"/>
-      <w:r>
-        <w:t>la 1</w:t>
+        <w:t>Ce test permet de vérifier le bon fonctionnement du programme lorsque le pivot, par exemple après la 1</w:t>
       </w:r>
       <w:r>
         <w:rPr>
@@ -8035,11 +9791,7 @@
         <w:t>ère</w:t>
       </w:r>
       <w:r>
-        <w:t xml:space="preserve"> soustraction réalisé</w:t>
-      </w:r>
-      <w:proofErr w:type="gramEnd"/>
-      <w:r>
-        <w:t>, est un pivot à 0.</w:t>
+        <w:t xml:space="preserve"> soustraction réalisé, est un pivot à 0.</w:t>
       </w:r>
     </w:p>
     <w:p>
@@ -8349,10 +10101,12 @@
       <w:pPr>
         <w:pStyle w:val="Titre3"/>
       </w:pPr>
+      <w:bookmarkStart w:id="15" w:name="_Toc231331314"/>
       <w:r>
         <w:lastRenderedPageBreak/>
         <w:t>Explication sur l’exécution :</w:t>
       </w:r>
+      <w:bookmarkEnd w:id="15"/>
     </w:p>
     <w:p>
       <w:pPr>
@@ -8361,11 +10115,9 @@
       <w:r>
         <w:t xml:space="preserve">Ce test permet de vérifier que le programme détecte bien les cas </w:t>
       </w:r>
-      <w:proofErr w:type="spellStart"/>
-      <w:r>
-        <w:t>ou</w:t>
-      </w:r>
-      <w:proofErr w:type="spellEnd"/>
+      <w:r>
+        <w:t>où</w:t>
+      </w:r>
       <w:r>
         <w:t xml:space="preserve"> le pivot est nul </w:t>
       </w:r>
@@ -8430,7 +10182,23 @@
               <w:sz w:val="36"/>
               <w:szCs w:val="36"/>
             </w:rPr>
-            <m:t>U après la 2ièm soustraction=</m:t>
+            <m:t>U après la 2ièm</m:t>
+          </m:r>
+          <m:r>
+            <w:rPr>
+              <w:rFonts w:ascii="Cambria Math" w:hAnsi="Cambria Math"/>
+              <w:sz w:val="36"/>
+              <w:szCs w:val="36"/>
+            </w:rPr>
+            <m:t>e</m:t>
+          </m:r>
+          <m:r>
+            <w:rPr>
+              <w:rFonts w:ascii="Cambria Math" w:hAnsi="Cambria Math"/>
+              <w:sz w:val="36"/>
+              <w:szCs w:val="36"/>
+            </w:rPr>
+            <m:t xml:space="preserve"> soustraction=</m:t>
           </m:r>
           <m:d>
             <m:dPr>
@@ -8573,7 +10341,13 @@
         <w:pStyle w:val="Textbody"/>
       </w:pPr>
       <w:r>
-        <w:t>Voici ci-dessous le contenu des variables au moment ou le pivot est détecté à 0 :</w:t>
+        <w:t>Voici ci-dessous le contenu des variables au moment o</w:t>
+      </w:r>
+      <w:r>
+        <w:t>ù</w:t>
+      </w:r>
+      <w:r>
+        <w:t xml:space="preserve"> le pivot est détecté à 0 :</w:t>
       </w:r>
     </w:p>
     <w:p>
@@ -8728,25 +10502,19 @@
       <w:pPr>
         <w:pStyle w:val="Titre2"/>
       </w:pPr>
+      <w:bookmarkStart w:id="16" w:name="_Toc231331315"/>
       <w:r>
         <w:lastRenderedPageBreak/>
         <w:t>Test #5 – Le dernier pivot à 0</w:t>
       </w:r>
+      <w:bookmarkEnd w:id="16"/>
     </w:p>
     <w:p>
       <w:pPr>
         <w:pStyle w:val="Textbody"/>
       </w:pPr>
       <w:r>
-        <w:t xml:space="preserve">Comme pour le test précédent, ce test est un test </w:t>
-      </w:r>
-      <w:proofErr w:type="gramStart"/>
-      <w:r>
-        <w:t>au limite</w:t>
-      </w:r>
-      <w:proofErr w:type="gramEnd"/>
-      <w:r>
-        <w:t>.</w:t>
+        <w:t>Comme pour le test précédent, ce test est un test au limite.</w:t>
       </w:r>
     </w:p>
     <w:p>
@@ -8756,13 +10524,9 @@
       <w:r>
         <w:t xml:space="preserve">Il consiste </w:t>
       </w:r>
-      <w:proofErr w:type="spellStart"/>
-      <w:proofErr w:type="gramStart"/>
-      <w:r>
-        <w:t>a</w:t>
-      </w:r>
-      <w:proofErr w:type="spellEnd"/>
-      <w:proofErr w:type="gramEnd"/>
+      <w:r>
+        <w:t>à</w:t>
+      </w:r>
       <w:r>
         <w:t xml:space="preserve"> vérifier le bon déroulement du programme lorsque le dernier pivot calculé est 0.</w:t>
       </w:r>
@@ -9122,21 +10886,11 @@
     <w:r>
       <w:t>/</w:t>
     </w:r>
-    <w:r>
-      <w:fldChar w:fldCharType="begin"/>
-    </w:r>
-    <w:r>
-      <w:instrText xml:space="preserve"> NUMPAGES </w:instrText>
-    </w:r>
-    <w:r>
-      <w:fldChar w:fldCharType="separate"/>
-    </w:r>
-    <w:r>
-      <w:t>30</w:t>
-    </w:r>
-    <w:r>
-      <w:fldChar w:fldCharType="end"/>
-    </w:r>
+    <w:fldSimple w:instr=" NUMPAGES ">
+      <w:r>
+        <w:t>30</w:t>
+      </w:r>
+    </w:fldSimple>
   </w:p>
 </w:ftr>
 </file>
@@ -9198,13 +10952,13 @@
               <w:szCs w:val="32"/>
             </w:rPr>
             <w:drawing>
-              <wp:anchor distT="0" distB="0" distL="114300" distR="114300" simplePos="0" relativeHeight="251663360" behindDoc="0" locked="0" layoutInCell="1" allowOverlap="1" wp14:anchorId="7D088268" wp14:editId="38CE7245">
+              <wp:anchor distT="0" distB="0" distL="114300" distR="114300" simplePos="0" relativeHeight="251663360" behindDoc="0" locked="0" layoutInCell="1" allowOverlap="1" wp14:anchorId="7D088268" wp14:editId="4E76C1B1">
                 <wp:simplePos x="0" y="0"/>
                 <wp:positionH relativeFrom="column">
-                  <wp:posOffset>-635</wp:posOffset>
+                  <wp:posOffset>88265</wp:posOffset>
                 </wp:positionH>
                 <wp:positionV relativeFrom="paragraph">
-                  <wp:posOffset>-684530</wp:posOffset>
+                  <wp:posOffset>-665480</wp:posOffset>
                 </wp:positionV>
                 <wp:extent cx="1653540" cy="657225"/>
                 <wp:effectExtent l="0" t="0" r="3810" b="9525"/>

</xml_diff>